<commit_message>
Refresh lab screenshots with restored local accounts
</commit_message>
<xml_diff>
--- a/docs/lab4/Ємельянова DevOps КН41 ЛР4 Індивідуальне завдання розширений.docx
+++ b/docs/lab4/Ємельянова DevOps КН41 ЛР4 Індивідуальне завдання розширений.docx
@@ -1771,7 +1771,7 @@
     </w:p>
     <w:p>
       <w:r>
-        <w:t>У Postman виконано колекцію з 30 запитів і 87 успішних перевірок. На рисунках наведено інтерфейс DoneGone, результати позитивних і негативних API-сценаріїв та локальні журнали тестів. Для демонстрації інтерфейсу створено окремий навчальний проєкт. Рисунки з терміналом Jest і Newman показують збережені журнали реальних повторних запусків.</w:t>
+        <w:t>У Postman виконано колекцію з 30 запитів і 87 успішних перевірок. На рисунках наведено інтерфейс DoneGone, результати позитивних і негативних API-сценаріїв та локальні журнали тестів. Для демонстрації інтерфейсу до поточної локальної бази перенесено два власні акаунти та проєкти Task1 і Task2 з попереднього етапу. У цих проєктах не було завдань, тому для ілюстрації роботи дошки до Task1 додано чотири навчальні завдання. Власник і учасник проєкту збережені; вихідна база даних не змінювалася. Рисунки з терміналом Jest і Newman показують збережені журнали реальних повторних запусків.</w:t>
       </w:r>
     </w:p>
     <w:p>
@@ -1783,7 +1783,7 @@
       <w:r>
         <w:drawing>
           <wp:inline xmlns:a="http://schemas.openxmlformats.org/drawingml/2006/main" xmlns:pic="http://schemas.openxmlformats.org/drawingml/2006/picture">
-            <wp:extent cx="6027799" cy="6839999"/>
+            <wp:extent cx="5076041" cy="5759999"/>
             <wp:docPr id="1" name="Picture 1"/>
             <wp:cNvGraphicFramePr>
               <a:graphicFrameLocks noChangeAspect="1"/>
@@ -1804,7 +1804,7 @@
                   <pic:spPr>
                     <a:xfrm>
                       <a:off x="0" y="0"/>
-                      <a:ext cx="6027799" cy="6839999"/>
+                      <a:ext cx="5076041" cy="5759999"/>
                     </a:xfrm>
                     <a:prstGeom prst="rect"/>
                   </pic:spPr>
@@ -1838,7 +1838,7 @@
       <w:r>
         <w:drawing>
           <wp:inline xmlns:a="http://schemas.openxmlformats.org/drawingml/2006/main" xmlns:pic="http://schemas.openxmlformats.org/drawingml/2006/picture">
-            <wp:extent cx="6027799" cy="6839999"/>
+            <wp:extent cx="6120000" cy="6641453"/>
             <wp:docPr id="2" name="Picture 2"/>
             <wp:cNvGraphicFramePr>
               <a:graphicFrameLocks noChangeAspect="1"/>
@@ -1859,7 +1859,7 @@
                   <pic:spPr>
                     <a:xfrm>
                       <a:off x="0" y="0"/>
-                      <a:ext cx="6027799" cy="6839999"/>
+                      <a:ext cx="6120000" cy="6641453"/>
                     </a:xfrm>
                     <a:prstGeom prst="rect"/>
                   </pic:spPr>
@@ -1893,7 +1893,7 @@
       <w:r>
         <w:drawing>
           <wp:inline xmlns:a="http://schemas.openxmlformats.org/drawingml/2006/main" xmlns:pic="http://schemas.openxmlformats.org/drawingml/2006/picture">
-            <wp:extent cx="6120000" cy="3211111"/>
+            <wp:extent cx="6120000" cy="1942857"/>
             <wp:docPr id="3" name="Picture 3"/>
             <wp:cNvGraphicFramePr>
               <a:graphicFrameLocks noChangeAspect="1"/>
@@ -1914,7 +1914,7 @@
                   <pic:spPr>
                     <a:xfrm>
                       <a:off x="0" y="0"/>
-                      <a:ext cx="6120000" cy="3211111"/>
+                      <a:ext cx="6120000" cy="1942857"/>
                     </a:xfrm>
                     <a:prstGeom prst="rect"/>
                   </pic:spPr>
@@ -1943,7 +1943,7 @@
       <w:r>
         <w:drawing>
           <wp:inline xmlns:a="http://schemas.openxmlformats.org/drawingml/2006/main" xmlns:pic="http://schemas.openxmlformats.org/drawingml/2006/picture">
-            <wp:extent cx="6120000" cy="3211111"/>
+            <wp:extent cx="6120000" cy="2509524"/>
             <wp:docPr id="4" name="Picture 4"/>
             <wp:cNvGraphicFramePr>
               <a:graphicFrameLocks noChangeAspect="1"/>
@@ -1964,7 +1964,7 @@
                   <pic:spPr>
                     <a:xfrm>
                       <a:off x="0" y="0"/>
-                      <a:ext cx="6120000" cy="3211111"/>
+                      <a:ext cx="6120000" cy="2509524"/>
                     </a:xfrm>
                     <a:prstGeom prst="rect"/>
                   </pic:spPr>
@@ -2053,7 +2053,7 @@
       <w:r>
         <w:drawing>
           <wp:inline xmlns:a="http://schemas.openxmlformats.org/drawingml/2006/main" xmlns:pic="http://schemas.openxmlformats.org/drawingml/2006/picture">
-            <wp:extent cx="3802393" cy="6839999"/>
+            <wp:extent cx="6120000" cy="5670310"/>
             <wp:docPr id="6" name="Picture 6"/>
             <wp:cNvGraphicFramePr>
               <a:graphicFrameLocks noChangeAspect="1"/>
@@ -2074,7 +2074,7 @@
                   <pic:spPr>
                     <a:xfrm>
                       <a:off x="0" y="0"/>
-                      <a:ext cx="3802393" cy="6839999"/>
+                      <a:ext cx="6120000" cy="5670310"/>
                     </a:xfrm>
                     <a:prstGeom prst="rect"/>
                   </pic:spPr>
@@ -2091,7 +2091,7 @@
         <w:jc w:val="center"/>
       </w:pPr>
       <w:r>
-        <w:t>Рис. 30. Демонстраційна дошка проєкту DoneGone із завданнями</w:t>
+        <w:t>Рис. 30. Дошка Task1 з власними акаунтами та навчальними завданнями</w:t>
       </w:r>
     </w:p>
     <w:p>
@@ -2108,7 +2108,7 @@
       <w:r>
         <w:drawing>
           <wp:inline xmlns:a="http://schemas.openxmlformats.org/drawingml/2006/main" xmlns:pic="http://schemas.openxmlformats.org/drawingml/2006/picture">
-            <wp:extent cx="3802393" cy="6839999"/>
+            <wp:extent cx="6120000" cy="5670310"/>
             <wp:docPr id="7" name="Picture 7"/>
             <wp:cNvGraphicFramePr>
               <a:graphicFrameLocks noChangeAspect="1"/>
@@ -2129,7 +2129,7 @@
                   <pic:spPr>
                     <a:xfrm>
                       <a:off x="0" y="0"/>
-                      <a:ext cx="3802393" cy="6839999"/>
+                      <a:ext cx="6120000" cy="5670310"/>
                     </a:xfrm>
                     <a:prstGeom prst="rect"/>
                   </pic:spPr>
@@ -2146,7 +2146,7 @@
         <w:jc w:val="center"/>
       </w:pPr>
       <w:r>
-        <w:t>Рис. 31. Форма створення завдання DoneGone</w:t>
+        <w:t>Рис. 31. Заповнена форма завдання з вибором виконавця у DoneGone</w:t>
       </w:r>
     </w:p>
     <w:p>
@@ -2158,7 +2158,7 @@
       <w:r>
         <w:drawing>
           <wp:inline xmlns:a="http://schemas.openxmlformats.org/drawingml/2006/main" xmlns:pic="http://schemas.openxmlformats.org/drawingml/2006/picture">
-            <wp:extent cx="6120000" cy="3211111"/>
+            <wp:extent cx="6120000" cy="3184127"/>
             <wp:docPr id="8" name="Picture 8"/>
             <wp:cNvGraphicFramePr>
               <a:graphicFrameLocks noChangeAspect="1"/>
@@ -2179,7 +2179,7 @@
                   <pic:spPr>
                     <a:xfrm>
                       <a:off x="0" y="0"/>
-                      <a:ext cx="6120000" cy="3211111"/>
+                      <a:ext cx="6120000" cy="3184127"/>
                     </a:xfrm>
                     <a:prstGeom prst="rect"/>
                   </pic:spPr>
@@ -2268,7 +2268,7 @@
       <w:r>
         <w:drawing>
           <wp:inline xmlns:a="http://schemas.openxmlformats.org/drawingml/2006/main" xmlns:pic="http://schemas.openxmlformats.org/drawingml/2006/picture">
-            <wp:extent cx="6027799" cy="6839999"/>
+            <wp:extent cx="6120000" cy="6641453"/>
             <wp:docPr id="10" name="Picture 10"/>
             <wp:cNvGraphicFramePr>
               <a:graphicFrameLocks noChangeAspect="1"/>
@@ -2289,7 +2289,7 @@
                   <pic:spPr>
                     <a:xfrm>
                       <a:off x="0" y="0"/>
-                      <a:ext cx="6027799" cy="6839999"/>
+                      <a:ext cx="6120000" cy="6641453"/>
                     </a:xfrm>
                     <a:prstGeom prst="rect"/>
                   </pic:spPr>

</xml_diff>